<commit_message>
Simplify project for guide review: remove footer content and name box, limit catalog to 5 movies
</commit_message>
<xml_diff>
--- a/Online_Movie_Ticket_Booking_System_Project_Report_Kombaiya_Ashik.docx
+++ b/Online_Movie_Ticket_Booking_System_Project_Report_Kombaiya_Ashik.docx
@@ -4,158 +4,321 @@
   <w:body>
     <w:p>
       <w:pPr>
+        <w:spacing w:before="200" w:after="560"/>
         <w:jc w:val="center"/>
       </w:pPr>
       <w:r>
         <w:rPr>
           <w:rFonts w:ascii="Calibri" w:hAnsi="Calibri"/>
           <w:b/>
-          <w:color w:val="64748B"/>
-          <w:sz w:val="26"/>
+          <w:color w:val="000000"/>
+          <w:sz w:val="30"/>
         </w:rPr>
-        <w:t>A PROJECT REPORT ON</w:t>
-        <w:br/>
+        <w:t>ONLINE MOVIE TICKET BOOKING &amp; THEATER MANAGEMENT SYSTEM</w:t>
       </w:r>
     </w:p>
     <w:p>
       <w:pPr>
-        <w:spacing w:before="320" w:after="280"/>
+        <w:spacing w:before="200" w:after="320"/>
         <w:jc w:val="center"/>
       </w:pPr>
       <w:r>
         <w:rPr>
           <w:rFonts w:ascii="Calibri" w:hAnsi="Calibri"/>
           <w:b/>
-          <w:color w:val="0F172A"/>
-          <w:sz w:val="44"/>
+          <w:color w:val="000000"/>
+          <w:sz w:val="24"/>
         </w:rPr>
-        <w:t>ONLINE MOVIE TICKET BOOKING &amp;</w:t>
-        <w:br/>
-        <w:t>THEATER MANAGEMENT SYSTEM</w:t>
+        <w:t>SUBMITTED BY</w:t>
+      </w:r>
+    </w:p>
+    <w:tbl>
+      <w:tblPr>
+        <w:tblW w:type="auto" w:w="0"/>
+        <w:jc w:val="center"/>
+        <w:tblLayout w:type="fixed"/>
+        <w:tblLook w:firstColumn="1" w:firstRow="1" w:lastColumn="0" w:lastRow="0" w:noHBand="0" w:noVBand="1" w:val="04A0"/>
+      </w:tblPr>
+      <w:tblGrid>
+        <w:gridCol w:w="3120"/>
+        <w:gridCol w:w="3120"/>
+        <w:gridCol w:w="3120"/>
+      </w:tblGrid>
+      <w:tr>
+        <w:tc>
+          <w:tcPr>
+            <w:tcW w:type="dxa" w:w="2592"/>
+          </w:tcPr>
+          <w:p>
+            <w:pPr>
+              <w:spacing w:before="40" w:after="40"/>
+            </w:pPr>
+            <w:r>
+              <w:rPr>
+                <w:rFonts w:ascii="Calibri" w:hAnsi="Calibri"/>
+                <w:b/>
+                <w:sz w:val="22"/>
+              </w:rPr>
+              <w:t>NAME</w:t>
+            </w:r>
+          </w:p>
+        </w:tc>
+        <w:tc>
+          <w:tcPr>
+            <w:tcW w:type="dxa" w:w="576"/>
+          </w:tcPr>
+          <w:p>
+            <w:pPr>
+              <w:spacing w:before="40" w:after="40"/>
+              <w:jc w:val="center"/>
+            </w:pPr>
+            <w:r>
+              <w:rPr>
+                <w:rFonts w:ascii="Calibri" w:hAnsi="Calibri"/>
+                <w:b/>
+                <w:sz w:val="22"/>
+              </w:rPr>
+              <w:t>:</w:t>
+            </w:r>
+          </w:p>
+        </w:tc>
+        <w:tc>
+          <w:tcPr>
+            <w:tcW w:type="dxa" w:w="6192"/>
+          </w:tcPr>
+          <w:p>
+            <w:pPr>
+              <w:spacing w:before="40" w:after="40"/>
+            </w:pPr>
+            <w:r>
+              <w:rPr>
+                <w:rFonts w:ascii="Calibri" w:hAnsi="Calibri"/>
+                <w:b/>
+                <w:sz w:val="22"/>
+              </w:rPr>
+              <w:t>KOMBAIYA &amp; ASHIK CHANDRU</w:t>
+            </w:r>
+          </w:p>
+        </w:tc>
+      </w:tr>
+      <w:tr>
+        <w:tc>
+          <w:tcPr>
+            <w:tcW w:type="dxa" w:w="2592"/>
+          </w:tcPr>
+          <w:p>
+            <w:pPr>
+              <w:spacing w:before="40" w:after="40"/>
+            </w:pPr>
+            <w:r>
+              <w:rPr>
+                <w:rFonts w:ascii="Calibri" w:hAnsi="Calibri"/>
+                <w:b/>
+                <w:sz w:val="22"/>
+              </w:rPr>
+              <w:t>REGISTER NO</w:t>
+            </w:r>
+          </w:p>
+        </w:tc>
+        <w:tc>
+          <w:tcPr>
+            <w:tcW w:type="dxa" w:w="576"/>
+          </w:tcPr>
+          <w:p>
+            <w:pPr>
+              <w:spacing w:before="40" w:after="40"/>
+              <w:jc w:val="center"/>
+            </w:pPr>
+            <w:r>
+              <w:rPr>
+                <w:rFonts w:ascii="Calibri" w:hAnsi="Calibri"/>
+                <w:b/>
+                <w:sz w:val="22"/>
+              </w:rPr>
+              <w:t>:</w:t>
+            </w:r>
+          </w:p>
+        </w:tc>
+        <w:tc>
+          <w:tcPr>
+            <w:tcW w:type="dxa" w:w="6192"/>
+          </w:tcPr>
+          <w:p>
+            <w:pPr>
+              <w:spacing w:before="40" w:after="40"/>
+            </w:pPr>
+            <w:r>
+              <w:rPr>
+                <w:rFonts w:ascii="Calibri" w:hAnsi="Calibri"/>
+                <w:b/>
+                <w:sz w:val="22"/>
+              </w:rPr>
+              <w:t>------------------------------------</w:t>
+            </w:r>
+          </w:p>
+        </w:tc>
+      </w:tr>
+      <w:tr>
+        <w:tc>
+          <w:tcPr>
+            <w:tcW w:type="dxa" w:w="2592"/>
+          </w:tcPr>
+          <w:p>
+            <w:pPr>
+              <w:spacing w:before="40" w:after="40"/>
+            </w:pPr>
+            <w:r>
+              <w:rPr>
+                <w:rFonts w:ascii="Calibri" w:hAnsi="Calibri"/>
+                <w:b/>
+                <w:sz w:val="22"/>
+              </w:rPr>
+              <w:t>PROJECT TITLE</w:t>
+            </w:r>
+          </w:p>
+        </w:tc>
+        <w:tc>
+          <w:tcPr>
+            <w:tcW w:type="dxa" w:w="576"/>
+          </w:tcPr>
+          <w:p>
+            <w:pPr>
+              <w:spacing w:before="40" w:after="40"/>
+              <w:jc w:val="center"/>
+            </w:pPr>
+            <w:r>
+              <w:rPr>
+                <w:rFonts w:ascii="Calibri" w:hAnsi="Calibri"/>
+                <w:b/>
+                <w:sz w:val="22"/>
+              </w:rPr>
+              <w:t>:</w:t>
+            </w:r>
+          </w:p>
+        </w:tc>
+        <w:tc>
+          <w:tcPr>
+            <w:tcW w:type="dxa" w:w="6192"/>
+          </w:tcPr>
+          <w:p>
+            <w:pPr>
+              <w:spacing w:before="40" w:after="40"/>
+            </w:pPr>
+            <w:r>
+              <w:rPr>
+                <w:rFonts w:ascii="Calibri" w:hAnsi="Calibri"/>
+                <w:b/>
+                <w:sz w:val="22"/>
+              </w:rPr>
+              <w:t>ONLINE MOVIE TICKET BOOKING &amp; THEATER MANAGEMENT SYSTEM</w:t>
+            </w:r>
+          </w:p>
+        </w:tc>
+      </w:tr>
+    </w:tbl>
+    <w:p>
+      <w:pPr>
+        <w:spacing w:before="400"/>
+      </w:pPr>
+    </w:p>
+    <w:p>
+      <w:pPr>
+        <w:spacing w:before="120" w:after="480"/>
+        <w:jc w:val="center"/>
+      </w:pPr>
+      <w:r>
+        <w:drawing>
+          <wp:inline xmlns:a="http://schemas.openxmlformats.org/drawingml/2006/main" xmlns:pic="http://schemas.openxmlformats.org/drawingml/2006/picture">
+            <wp:extent cx="1920240" cy="2284593"/>
+            <wp:docPr id="1" name="Picture 1"/>
+            <wp:cNvGraphicFramePr>
+              <a:graphicFrameLocks noChangeAspect="1"/>
+            </wp:cNvGraphicFramePr>
+            <a:graphic>
+              <a:graphicData uri="http://schemas.openxmlformats.org/drawingml/2006/picture">
+                <pic:pic>
+                  <pic:nvPicPr>
+                    <pic:cNvPr id="0" name="msu_college_logo.png"/>
+                    <pic:cNvPicPr/>
+                  </pic:nvPicPr>
+                  <pic:blipFill>
+                    <a:blip r:embed="rId10"/>
+                    <a:stretch>
+                      <a:fillRect/>
+                    </a:stretch>
+                  </pic:blipFill>
+                  <pic:spPr>
+                    <a:xfrm>
+                      <a:off x="0" y="0"/>
+                      <a:ext cx="1920240" cy="2284593"/>
+                    </a:xfrm>
+                    <a:prstGeom prst="rect"/>
+                  </pic:spPr>
+                </pic:pic>
+              </a:graphicData>
+            </a:graphic>
+          </wp:inline>
+        </w:drawing>
       </w:r>
     </w:p>
     <w:p>
       <w:pPr>
-        <w:jc w:val="center"/>
-      </w:pPr>
-      <w:r>
-        <w:rPr>
-          <w:rFonts w:ascii="Calibri" w:hAnsi="Calibri"/>
-          <w:i/>
-          <w:color w:val="475569"/>
-          <w:sz w:val="23"/>
-        </w:rPr>
-        <w:t>A Modern Full-Stack Web Application Featuring TicketNew/BookMyShow Showtime Scheduling, Real-Time Show Expiration, 3-Block Auditorium Seating Matrix, Concurrency Seat Locking, and Instant E-Ticket Generation</w:t>
-        <w:br/>
-      </w:r>
-    </w:p>
-    <w:p>
-      <w:pPr>
-        <w:spacing w:before="600"/>
-      </w:pPr>
-    </w:p>
-    <w:p>
-      <w:pPr>
+        <w:spacing w:before="80" w:after="80"/>
         <w:jc w:val="center"/>
       </w:pPr>
       <w:r>
         <w:rPr>
           <w:rFonts w:ascii="Calibri" w:hAnsi="Calibri"/>
           <w:b/>
-          <w:color w:val="334155"/>
-          <w:sz w:val="24"/>
+          <w:color w:val="000000"/>
+          <w:sz w:val="26"/>
         </w:rPr>
-        <w:t>Submitted in partial fulfillment of the requirements</w:t>
-        <w:br/>
-        <w:t>for the Degree of</w:t>
-        <w:br/>
-        <w:t>BACHELOR OF TECHNOLOGY</w:t>
-        <w:br/>
-        <w:t>in</w:t>
-        <w:br/>
-        <w:t>COMPUTER SCIENCE AND ENGINEERING</w:t>
-        <w:br/>
+        <w:t>DEPARTMENT OF COMPUTER SCIENCE</w:t>
       </w:r>
     </w:p>
     <w:p>
       <w:pPr>
-        <w:spacing w:before="600"/>
-      </w:pPr>
-    </w:p>
-    <w:p>
-      <w:pPr>
+        <w:spacing w:before="80" w:after="80"/>
         <w:jc w:val="center"/>
       </w:pPr>
       <w:r>
         <w:rPr>
           <w:rFonts w:ascii="Calibri" w:hAnsi="Calibri"/>
           <w:b/>
-          <w:color w:val="64748B"/>
-          <w:sz w:val="24"/>
+          <w:color w:val="000000"/>
+          <w:sz w:val="26"/>
         </w:rPr>
-        <w:t>DESIGNED AND DEVELOPED BY</w:t>
-        <w:br/>
-        <w:br/>
-      </w:r>
-      <w:r>
-        <w:rPr>
-          <w:rFonts w:ascii="Calibri" w:hAnsi="Calibri"/>
-          <w:b/>
-          <w:color w:val="E11D48"/>
-          <w:sz w:val="30"/>
-        </w:rPr>
-        <w:t>KOMBAIYA</w:t>
-        <w:br/>
-      </w:r>
-      <w:r>
-        <w:rPr>
-          <w:rFonts w:ascii="Calibri" w:hAnsi="Calibri"/>
-          <w:i/>
-          <w:sz w:val="21"/>
-        </w:rPr>
-        <w:t>(Frontend Architecture, UI/UX Engineering, Seating Matrix &amp; Showtime Engine)</w:t>
-        <w:br/>
-        <w:br/>
-      </w:r>
-      <w:r>
-        <w:rPr>
-          <w:rFonts w:ascii="Calibri" w:hAnsi="Calibri"/>
-          <w:b/>
-          <w:color w:val="0284C7"/>
-          <w:sz w:val="30"/>
-        </w:rPr>
-        <w:t>ASHIK CHANDRU</w:t>
-        <w:br/>
-      </w:r>
-      <w:r>
-        <w:rPr>
-          <w:rFonts w:ascii="Calibri" w:hAnsi="Calibri"/>
-          <w:i/>
-          <w:sz w:val="21"/>
-        </w:rPr>
-        <w:t>(Backend REST API, State Persistence, Database Management &amp; Admin Console)</w:t>
-        <w:br/>
+        <w:t>MANONMANIAM SUNDARANAR UNIVERSITY COLLEGE</w:t>
       </w:r>
     </w:p>
     <w:p>
       <w:pPr>
-        <w:spacing w:before="600"/>
-      </w:pPr>
-    </w:p>
-    <w:p>
-      <w:pPr>
+        <w:spacing w:before="80" w:after="320"/>
         <w:jc w:val="center"/>
       </w:pPr>
       <w:r>
         <w:rPr>
           <w:rFonts w:ascii="Calibri" w:hAnsi="Calibri"/>
           <w:b/>
-          <w:color w:val="64748B"/>
-          <w:sz w:val="22"/>
+          <w:color w:val="000000"/>
+          <w:sz w:val="24"/>
         </w:rPr>
-        <w:t>ACADEMIC YEAR: 2025 – 2026</w:t>
-        <w:br/>
-        <w:t>DEPARTMENT OF COMPUTER SCIENCE &amp; ENGINEERING</w:t>
+        <w:t>GOVINDAPERI – 627414</w:t>
+      </w:r>
+    </w:p>
+    <w:p>
+      <w:pPr>
+        <w:spacing w:before="80" w:after="0"/>
+        <w:jc w:val="center"/>
+      </w:pPr>
+      <w:r>
+        <w:rPr>
+          <w:rFonts w:ascii="Calibri" w:hAnsi="Calibri"/>
+          <w:b/>
+          <w:color w:val="000000"/>
+          <w:sz w:val="24"/>
+        </w:rPr>
+        <w:t>OCTOBER - 2026</w:t>
       </w:r>
     </w:p>
     <w:p>
@@ -163,104 +326,11 @@
         <w:br w:type="page"/>
       </w:r>
     </w:p>
-    <w:p>
-      <w:pPr>
-        <w:pStyle w:val="Heading1"/>
-        <w:keepNext/>
-        <w:spacing w:before="280" w:after="120"/>
-      </w:pPr>
-      <w:r>
-        <w:rPr>
-          <w:rFonts w:ascii="Calibri" w:hAnsi="Calibri"/>
-          <w:b/>
-          <w:color w:val="0F172A"/>
-          <w:sz w:val="34"/>
-        </w:rPr>
-        <w:t>BONAFIDE CERTIFICATE</w:t>
-      </w:r>
-    </w:p>
-    <w:p>
-      <w:pPr>
-        <w:spacing w:before="0" w:after="120" w:line="276" w:lineRule="auto"/>
-        <w:jc w:val="both"/>
-      </w:pPr>
-      <w:r>
-        <w:rPr>
-          <w:rFonts w:ascii="Calibri" w:hAnsi="Calibri"/>
-          <w:i w:val="0"/>
-          <w:color w:val="334155"/>
-          <w:sz w:val="22"/>
-        </w:rPr>
-        <w:t>This is to certify that the project report entitled "ONLINE MOVIE TICKET BOOKING &amp; THEATER MANAGEMENT SYSTEM" is the bonafide work carried out by:</w:t>
-      </w:r>
-    </w:p>
-    <w:p>
-      <w:pPr>
-        <w:pStyle w:val="ListBullet"/>
-        <w:spacing w:before="20" w:after="60" w:line="276" w:lineRule="auto"/>
-      </w:pPr>
-      <w:r>
-        <w:rPr>
-          <w:rFonts w:ascii="Calibri" w:hAnsi="Calibri"/>
-          <w:color w:val="334155"/>
-          <w:sz w:val="21"/>
-        </w:rPr>
-        <w:t>KOMBAIYA (Frontend Architecture, UI/UX Engineering &amp; Seating Matrix)</w:t>
-      </w:r>
-    </w:p>
-    <w:p>
-      <w:pPr>
-        <w:pStyle w:val="ListBullet"/>
-        <w:spacing w:before="20" w:after="60" w:line="276" w:lineRule="auto"/>
-      </w:pPr>
-      <w:r>
-        <w:rPr>
-          <w:rFonts w:ascii="Calibri" w:hAnsi="Calibri"/>
-          <w:color w:val="334155"/>
-          <w:sz w:val="21"/>
-        </w:rPr>
-        <w:t>ASHIK CHANDRU (Backend REST API, State Persistence &amp; Admin Console)</w:t>
-      </w:r>
-    </w:p>
-    <w:p>
-      <w:pPr>
-        <w:spacing w:before="0" w:after="120" w:line="276" w:lineRule="auto"/>
-        <w:jc w:val="both"/>
-      </w:pPr>
-      <w:r>
-        <w:rPr>
-          <w:rFonts w:ascii="Calibri" w:hAnsi="Calibri"/>
-          <w:i w:val="0"/>
-          <w:color w:val="334155"/>
-          <w:sz w:val="22"/>
-        </w:rPr>
-        <w:t>who carried out the project work under my supervision in partial fulfillment of the requirements for the award of the Degree of Bachelor of Technology in Computer Science and Engineering during the academic year 2025 – 2026.</w:t>
-      </w:r>
-    </w:p>
-    <w:p>
-      <w:pPr>
-        <w:spacing w:before="0" w:after="120" w:line="276" w:lineRule="auto"/>
-        <w:jc w:val="both"/>
-      </w:pPr>
-      <w:r>
-        <w:rPr>
-          <w:rFonts w:ascii="Calibri" w:hAnsi="Calibri"/>
-          <w:i w:val="0"/>
-          <w:color w:val="334155"/>
-          <w:sz w:val="22"/>
-        </w:rPr>
-        <w:t>The results and implementations embodied in this report have been thoroughly developed, tested, and verified on a live web server and have not been submitted to any other University or Institute for the award of any degree or diploma.</w:t>
-      </w:r>
-    </w:p>
-    <w:p>
-      <w:pPr>
-        <w:spacing w:before="1200"/>
-      </w:pPr>
-    </w:p>
     <w:tbl>
       <w:tblPr>
         <w:tblW w:type="auto" w:w="0"/>
         <w:jc w:val="center"/>
+        <w:tblLayout w:type="fixed"/>
         <w:tblLook w:firstColumn="1" w:firstRow="1" w:lastColumn="0" w:lastRow="0" w:noHBand="0" w:noVBand="1" w:val="04A0"/>
       </w:tblPr>
       <w:tblGrid>
@@ -270,42 +340,259 @@
       <w:tr>
         <w:tc>
           <w:tcPr>
-            <w:tcW w:type="dxa" w:w="4608"/>
-          </w:tcPr>
-          <w:p>
+            <w:tcW w:type="dxa" w:w="4680"/>
+          </w:tcPr>
+          <w:p>
+            <w:pPr>
+              <w:jc w:val="left"/>
+            </w:pPr>
+            <w:r>
+              <w:drawing>
+                <wp:inline xmlns:a="http://schemas.openxmlformats.org/drawingml/2006/main" xmlns:pic="http://schemas.openxmlformats.org/drawingml/2006/picture">
+                  <wp:extent cx="1097280" cy="1305482"/>
+                  <wp:docPr id="2" name="Picture 2"/>
+                  <wp:cNvGraphicFramePr>
+                    <a:graphicFrameLocks noChangeAspect="1"/>
+                  </wp:cNvGraphicFramePr>
+                  <a:graphic>
+                    <a:graphicData uri="http://schemas.openxmlformats.org/drawingml/2006/picture">
+                      <pic:pic>
+                        <pic:nvPicPr>
+                          <pic:cNvPr id="0" name="msu_college_logo.png"/>
+                          <pic:cNvPicPr/>
+                        </pic:nvPicPr>
+                        <pic:blipFill>
+                          <a:blip r:embed="rId10"/>
+                          <a:stretch>
+                            <a:fillRect/>
+                          </a:stretch>
+                        </pic:blipFill>
+                        <pic:spPr>
+                          <a:xfrm>
+                            <a:off x="0" y="0"/>
+                            <a:ext cx="1097280" cy="1305482"/>
+                          </a:xfrm>
+                          <a:prstGeom prst="rect"/>
+                        </pic:spPr>
+                      </pic:pic>
+                    </a:graphicData>
+                  </a:graphic>
+                </wp:inline>
+              </w:drawing>
+            </w:r>
+          </w:p>
+        </w:tc>
+        <w:tc>
+          <w:tcPr>
+            <w:tcW w:type="dxa" w:w="4680"/>
+          </w:tcPr>
+          <w:p>
+            <w:pPr>
+              <w:jc w:val="right"/>
+            </w:pPr>
+            <w:r>
+              <w:drawing>
+                <wp:inline xmlns:a="http://schemas.openxmlformats.org/drawingml/2006/main" xmlns:pic="http://schemas.openxmlformats.org/drawingml/2006/picture">
+                  <wp:extent cx="1005840" cy="579120"/>
+                  <wp:docPr id="3" name="Picture 3"/>
+                  <wp:cNvGraphicFramePr>
+                    <a:graphicFrameLocks noChangeAspect="1"/>
+                  </wp:cNvGraphicFramePr>
+                  <a:graphic>
+                    <a:graphicData uri="http://schemas.openxmlformats.org/drawingml/2006/picture">
+                      <pic:pic>
+                        <pic:nvPicPr>
+                          <pic:cNvPr id="0" name="tn_skills_logo.png"/>
+                          <pic:cNvPicPr/>
+                        </pic:nvPicPr>
+                        <pic:blipFill>
+                          <a:blip r:embed="rId11"/>
+                          <a:stretch>
+                            <a:fillRect/>
+                          </a:stretch>
+                        </pic:blipFill>
+                        <pic:spPr>
+                          <a:xfrm>
+                            <a:off x="0" y="0"/>
+                            <a:ext cx="1005840" cy="579120"/>
+                          </a:xfrm>
+                          <a:prstGeom prst="rect"/>
+                        </pic:spPr>
+                      </pic:pic>
+                    </a:graphicData>
+                  </a:graphic>
+                </wp:inline>
+              </w:drawing>
+            </w:r>
+          </w:p>
+        </w:tc>
+      </w:tr>
+    </w:tbl>
+    <w:p>
+      <w:pPr>
+        <w:spacing w:before="400"/>
+      </w:pPr>
+    </w:p>
+    <w:p>
+      <w:pPr>
+        <w:spacing w:before="0" w:after="200"/>
+        <w:jc w:val="center"/>
+      </w:pPr>
+      <w:r>
+        <w:rPr>
+          <w:rFonts w:ascii="Calibri" w:hAnsi="Calibri"/>
+          <w:b/>
+          <w:i/>
+          <w:color w:val="000000"/>
+          <w:sz w:val="28"/>
+        </w:rPr>
+        <w:t>DEPARTMENT OF COMPUTER SCIENCE</w:t>
+      </w:r>
+    </w:p>
+    <w:p>
+      <w:pPr>
+        <w:spacing w:before="80" w:after="480"/>
+        <w:jc w:val="center"/>
+      </w:pPr>
+      <w:r>
+        <w:rPr>
+          <w:rFonts w:ascii="Calibri" w:hAnsi="Calibri"/>
+          <w:b/>
+          <w:color w:val="000000"/>
+          <w:sz w:val="28"/>
+          <w:u w:val="single"/>
+        </w:rPr>
+        <w:t>BONAFIDE CERTIFICATE</w:t>
+      </w:r>
+    </w:p>
+    <w:p>
+      <w:pPr>
+        <w:spacing w:line="312" w:lineRule="auto" w:after="480"/>
+        <w:jc w:val="both"/>
+      </w:pPr>
+      <w:r>
+        <w:rPr>
+          <w:rFonts w:ascii="Calibri" w:hAnsi="Calibri"/>
+          <w:sz w:val="22"/>
+        </w:rPr>
+        <w:t xml:space="preserve">This is to certify that </w:t>
+      </w:r>
+      <w:r>
+        <w:rPr>
+          <w:rFonts w:ascii="Calibri" w:hAnsi="Calibri"/>
+          <w:b/>
+          <w:sz w:val="22"/>
+          <w:u w:val="single"/>
+        </w:rPr>
+        <w:t>KOMBAIYA and ASHIK CHANDRU</w:t>
+      </w:r>
+      <w:r>
+        <w:rPr>
+          <w:rFonts w:ascii="Calibri" w:hAnsi="Calibri"/>
+          <w:sz w:val="22"/>
+        </w:rPr>
+        <w:t xml:space="preserve"> (Reg.No: ------------------------------------) a bonafide student of </w:t>
+      </w:r>
+      <w:r>
+        <w:rPr>
+          <w:rFonts w:ascii="Calibri" w:hAnsi="Calibri"/>
+          <w:b/>
+          <w:sz w:val="22"/>
+        </w:rPr>
+        <w:t>B.Sc Computer Science</w:t>
+      </w:r>
+      <w:r>
+        <w:rPr>
+          <w:rFonts w:ascii="Calibri" w:hAnsi="Calibri"/>
+          <w:sz w:val="22"/>
+        </w:rPr>
+        <w:t xml:space="preserve">, submitted the project </w:t>
+      </w:r>
+      <w:r>
+        <w:rPr>
+          <w:rFonts w:ascii="Calibri" w:hAnsi="Calibri"/>
+          <w:b/>
+          <w:sz w:val="22"/>
+          <w:u w:val="single"/>
+        </w:rPr>
+        <w:t>ONLINE MOVIE TICKET BOOKING &amp; THEATER MANAGEMENT SYSTEM</w:t>
+      </w:r>
+      <w:r>
+        <w:rPr>
+          <w:rFonts w:ascii="Calibri" w:hAnsi="Calibri"/>
+          <w:sz w:val="22"/>
+        </w:rPr>
+        <w:t xml:space="preserve"> in External Assessment held on -------------------------- during the Academic Year 2026-2027.</w:t>
+      </w:r>
+    </w:p>
+    <w:p>
+      <w:pPr>
+        <w:spacing w:line="288" w:lineRule="auto" w:after="900"/>
+      </w:pPr>
+      <w:r>
+        <w:rPr>
+          <w:rFonts w:ascii="Calibri" w:hAnsi="Calibri"/>
+          <w:sz w:val="22"/>
+        </w:rPr>
+        <w:t>Place: Govindaperi</w:t>
+        <w:br/>
+        <w:t>Date : --------------------------</w:t>
+      </w:r>
+    </w:p>
+    <w:tbl>
+      <w:tblPr>
+        <w:tblW w:type="auto" w:w="0"/>
+        <w:jc w:val="center"/>
+        <w:tblLayout w:type="fixed"/>
+        <w:tblLook w:firstColumn="1" w:firstRow="1" w:lastColumn="0" w:lastRow="0" w:noHBand="0" w:noVBand="1" w:val="04A0"/>
+      </w:tblPr>
+      <w:tblGrid>
+        <w:gridCol w:w="4680"/>
+        <w:gridCol w:w="4680"/>
+      </w:tblGrid>
+      <w:tr>
+        <w:tc>
+          <w:tcPr>
+            <w:tcW w:type="dxa" w:w="4680"/>
+          </w:tcPr>
+          <w:p>
+            <w:pPr>
+              <w:spacing w:after="0"/>
+            </w:pPr>
             <w:r>
               <w:rPr>
                 <w:rFonts w:ascii="Calibri" w:hAnsi="Calibri"/>
                 <w:b/>
-                <w:sz w:val="20"/>
-              </w:rPr>
-              <w:t>________________________</w:t>
+                <w:sz w:val="21"/>
+              </w:rPr>
+              <w:t>MRS. RAJI</w:t>
               <w:br/>
-              <w:t>INTERNAL GUIDE</w:t>
+              <w:t>Staff Incharge / Project Guide</w:t>
               <w:br/>
-              <w:t>Department of CSE</w:t>
-            </w:r>
-          </w:p>
-        </w:tc>
-        <w:tc>
-          <w:tcPr>
-            <w:tcW w:type="dxa" w:w="4608"/>
-          </w:tcPr>
-          <w:p>
-            <w:pPr>
+              <w:t>Department of Computer Science</w:t>
+            </w:r>
+          </w:p>
+        </w:tc>
+        <w:tc>
+          <w:tcPr>
+            <w:tcW w:type="dxa" w:w="4680"/>
+          </w:tcPr>
+          <w:p>
+            <w:pPr>
+              <w:spacing w:after="0"/>
               <w:jc w:val="right"/>
             </w:pPr>
             <w:r>
               <w:rPr>
                 <w:rFonts w:ascii="Calibri" w:hAnsi="Calibri"/>
                 <w:b/>
-                <w:sz w:val="20"/>
-              </w:rPr>
-              <w:t>________________________</w:t>
+                <w:sz w:val="21"/>
+              </w:rPr>
+              <w:t>HEAD OF DEPARTMENT</w:t>
               <w:br/>
-              <w:t>HEAD OF THE DEPARTMENT</w:t>
+              <w:t>Department of Computer Science</w:t>
               <w:br/>
-              <w:t>Department of CSE</w:t>
+              <w:t>MSU College, Govindaperi</w:t>
             </w:r>
           </w:p>
         </w:tc>
@@ -316,25 +603,11 @@
         <w:spacing w:before="800"/>
       </w:pPr>
     </w:p>
-    <w:p>
-      <w:pPr>
-        <w:spacing w:before="0" w:after="120" w:line="276" w:lineRule="auto"/>
-        <w:jc w:val="both"/>
-      </w:pPr>
-      <w:r>
-        <w:rPr>
-          <w:rFonts w:ascii="Calibri" w:hAnsi="Calibri"/>
-          <w:i w:val="0"/>
-          <w:color w:val="334155"/>
-          <w:sz w:val="22"/>
-        </w:rPr>
-        <w:t>Submitted for the University Viva-Voce Examination held on: _____________________</w:t>
-      </w:r>
-    </w:p>
     <w:tbl>
       <w:tblPr>
         <w:tblW w:type="auto" w:w="0"/>
         <w:jc w:val="center"/>
+        <w:tblLayout w:type="fixed"/>
         <w:tblLook w:firstColumn="1" w:firstRow="1" w:lastColumn="0" w:lastRow="0" w:noHBand="0" w:noVBand="1" w:val="04A0"/>
       </w:tblPr>
       <w:tblGrid>
@@ -344,42 +617,38 @@
       <w:tr>
         <w:tc>
           <w:tcPr>
-            <w:tcW w:type="dxa" w:w="4608"/>
-          </w:tcPr>
-          <w:p>
+            <w:tcW w:type="dxa" w:w="4680"/>
+          </w:tcPr>
+          <w:p>
+            <w:pPr>
+              <w:spacing w:after="0"/>
+            </w:pPr>
             <w:r>
               <w:rPr>
                 <w:rFonts w:ascii="Calibri" w:hAnsi="Calibri"/>
                 <w:b/>
-                <w:sz w:val="20"/>
-              </w:rPr>
-              <w:br/>
-              <w:br/>
-              <w:t>________________________</w:t>
-              <w:br/>
-              <w:t>INTERNAL EXAMINER</w:t>
-            </w:r>
-          </w:p>
-        </w:tc>
-        <w:tc>
-          <w:tcPr>
-            <w:tcW w:type="dxa" w:w="4608"/>
-          </w:tcPr>
-          <w:p>
-            <w:pPr>
+                <w:sz w:val="21"/>
+              </w:rPr>
+              <w:t>Internal Examiner</w:t>
+            </w:r>
+          </w:p>
+        </w:tc>
+        <w:tc>
+          <w:tcPr>
+            <w:tcW w:type="dxa" w:w="4680"/>
+          </w:tcPr>
+          <w:p>
+            <w:pPr>
+              <w:spacing w:after="0"/>
               <w:jc w:val="right"/>
             </w:pPr>
             <w:r>
               <w:rPr>
                 <w:rFonts w:ascii="Calibri" w:hAnsi="Calibri"/>
                 <w:b/>
-                <w:sz w:val="20"/>
-              </w:rPr>
-              <w:br/>
-              <w:br/>
-              <w:t>________________________</w:t>
-              <w:br/>
-              <w:t>EXTERNAL EXAMINER</w:t>
+                <w:sz w:val="21"/>
+              </w:rPr>
+              <w:t>External Examiner</w:t>
             </w:r>
           </w:p>
         </w:tc>
@@ -401,7 +670,7 @@
           <w:rFonts w:ascii="Calibri" w:hAnsi="Calibri"/>
           <w:b/>
           <w:color w:val="0F172A"/>
-          <w:sz w:val="34"/>
+          <w:sz w:val="32"/>
         </w:rPr>
         <w:t>ACKNOWLEDGEMENT</w:t>
       </w:r>
@@ -418,7 +687,7 @@
           <w:color w:val="334155"/>
           <w:sz w:val="22"/>
         </w:rPr>
-        <w:t>We express our sincere gratitude and indebtedness to our College Management, Principal, and Head of the Department of Computer Science &amp; Engineering for providing the laboratory infrastructure, network facilities, and continuous encouragement needed to develop and host this Online Movie Ticket Booking &amp; Theater Management System.</w:t>
+        <w:t>We express our sincere gratitude and indebtedness to our College Management, Principal, and Head of the Department of Computer Science, Manonmaniam Sundaranar University College, Govindaperi, for providing the computer laboratory infrastructure, internet connectivity, and continuous encouragement needed to develop and host this Online Movie Ticket Booking &amp; Theater Management System.</w:t>
       </w:r>
     </w:p>
     <w:p>
@@ -433,7 +702,7 @@
           <w:color w:val="334155"/>
           <w:sz w:val="22"/>
         </w:rPr>
-        <w:t>We convey our deepest sense of appreciation and heartfelt thanks to our Project Guide for their constant guidance, valuable suggestions, technical insights, and constructive reviews throughout the system development and verification lifecycle.</w:t>
+        <w:t>We convey our deepest sense of appreciation and heartfelt thanks to our Project Guide MRS. RAJI, Staff Incharge, Department of Computer Science, for her invaluable guidance, technical reviews, constructive suggestions, and continuous mentorship throughout the software design, testing, and implementation phases.</w:t>
       </w:r>
     </w:p>
     <w:p>
@@ -448,7 +717,7 @@
           <w:color w:val="334155"/>
           <w:sz w:val="22"/>
         </w:rPr>
-        <w:t>We also express our sincere thanks to all faculty members and non-teaching technical staff of the Department of Computer Science &amp; Engineering for their direct and indirect support during the design, coding, testing, and deployment phases.</w:t>
+        <w:t>We also express our sincere thanks to all faculty members and technical staff of the Department of Computer Science for their direct and indirect support during the design, coding, testing, and verification of this web application.</w:t>
       </w:r>
     </w:p>
     <w:p>
@@ -463,7 +732,7 @@
           <w:color w:val="334155"/>
           <w:sz w:val="22"/>
         </w:rPr>
-        <w:t>Finally, we dedicate this work with immense gratitude to our parents and friends whose unwavering moral support, encouragement, and patience served as our greatest pillars of strength throughout this project endeavor.</w:t>
+        <w:t>Finally, we dedicate this work with immense gratitude to our parents and friends whose unwavering moral support, encouragement, and patience served as our greatest pillars of strength throughout this project journey.</w:t>
       </w:r>
     </w:p>
     <w:p>
@@ -484,7 +753,9 @@
         </w:rPr>
         <w:t>KOMBAIYA &amp; ASHIK CHANDRU</w:t>
         <w:br/>
-        <w:t>Department of Computer Science &amp; Engineering</w:t>
+        <w:t>Department of Computer Science</w:t>
+        <w:br/>
+        <w:t>Manonmaniam Sundaranar University College, Govindaperi</w:t>
       </w:r>
     </w:p>
     <w:p>
@@ -503,7 +774,7 @@
           <w:rFonts w:ascii="Calibri" w:hAnsi="Calibri"/>
           <w:b/>
           <w:color w:val="0F172A"/>
-          <w:sz w:val="34"/>
+          <w:sz w:val="32"/>
         </w:rPr>
         <w:t>ABSTRACT</w:t>
       </w:r>
@@ -520,7 +791,7 @@
           <w:color w:val="334155"/>
           <w:sz w:val="22"/>
         </w:rPr>
-        <w:t>The entertainment ticketing industry in India, led by platforms like TicketNew, BookMyShow, and regional multiplexes (such as Ram Muthuram Cinemas, Tirunelveli), requires robust, reliable, and user-friendly digital reservation portals. Many academic ticketing systems either overcomplicate user flows with unnecessary 3D graphics or food concession up-sells, or fail to accurately model real-world cinema auditorium seating geometries and time-based screening rules.</w:t>
+        <w:t>The entertainment ticketing industry in India, led by platforms like TicketNew, BookMyShow, and regional cinema complexes (such as Ram Muthuram Cinemas, Tirunelveli), requires robust, reliable, and user-friendly digital reservation portals. Many academic ticketing systems either overcomplicate user flows with unnecessary 3D graphics and food concession up-sells, or fail to accurately model real-world cinema auditorium seating geometries and time-based screening rules.</w:t>
       </w:r>
     </w:p>
     <w:p>
@@ -535,7 +806,7 @@
           <w:color w:val="334155"/>
           <w:sz w:val="22"/>
         </w:rPr>
-        <w:t>This project presents the design and full-stack implementation of the Online Movie Ticket Booking &amp; Theater Management System (CinePass), built purposefully using React 18, Vite, Tailwind CSS, Node.js, Express, and JSON Database storage. The architecture has been refined to eliminate all non-essential visual overheads, focusing on real-world practical operations:</w:t>
+        <w:t>This project presents the design and full-stack implementation of the Online Movie Ticket Booking &amp; Theater Management System (CinePass), built purposefully using React 18, Vite, Tailwind CSS, Node.js, Express, and JSON Database storage. Developed by Kombaiya and Ashik Chandru under the guidance of MRS. RAJI in the Department of Computer Science, Manonmaniam Sundaranar University College, Govindaperi, the architecture eliminates all non-essential visual overheads, focusing on real-world practical operations:</w:t>
       </w:r>
     </w:p>
     <w:p>
@@ -688,7 +959,7 @@
           <w:color w:val="334155"/>
           <w:sz w:val="22"/>
         </w:rPr>
-        <w:t>Comprehensive unit, integration, and concurrency tests verify that the system operates stably, eliminates double-booking hazards, guarantees zero visual distortion across devices, and delivers an authentic ticketing experience ready for academic viva and commercial evaluation.</w:t>
+        <w:t>Comprehensive unit, integration, and concurrency tests verify that the system operates stably, eliminates double-booking hazards, guarantees zero visual distortion across devices, and delivers an authentic ticketing experience ready for university viva evaluation.</w:t>
       </w:r>
     </w:p>
     <w:p>
@@ -707,7 +978,7 @@
           <w:rFonts w:ascii="Calibri" w:hAnsi="Calibri"/>
           <w:b/>
           <w:color w:val="0F172A"/>
-          <w:sz w:val="34"/>
+          <w:sz w:val="32"/>
         </w:rPr>
         <w:t>TABLE OF CONTENTS</w:t>
       </w:r>
@@ -4330,7 +4601,7 @@
           <w:rFonts w:ascii="Calibri" w:hAnsi="Calibri"/>
           <w:b/>
           <w:color w:val="0F172A"/>
-          <w:sz w:val="34"/>
+          <w:sz w:val="32"/>
         </w:rPr>
         <w:t>CHAPTER 1: INTRODUCTION</w:t>
       </w:r>
@@ -4346,7 +4617,7 @@
           <w:rFonts w:ascii="Calibri" w:hAnsi="Calibri"/>
           <w:b/>
           <w:color w:val="1E3A8A"/>
-          <w:sz w:val="27"/>
+          <w:sz w:val="26"/>
         </w:rPr>
         <w:t>1.1 Background and Motivation</w:t>
       </w:r>
@@ -4378,7 +4649,7 @@
           <w:color w:val="334155"/>
           <w:sz w:val="22"/>
         </w:rPr>
-        <w:t>During college academic evaluations and viva presentations, student projects often suffer from two distinct pitfalls: either they are burdened with heavy, unoptimized 3D graphics (WebGL/Three.js) that distract from core full-stack software engineering principles, or they utilize overly simplistic, generic seat grids that fail to mirror real Indian cinema standards (such as row-wise price tiering, aisle separation, and government-mandated price caps).</w:t>
+        <w:t>During college academic evaluations and viva presentations in the Department of Computer Science, student projects often suffer from two distinct pitfalls: either they are burdened with heavy, unoptimized 3D graphics (WebGL/Three.js) that distract from core software engineering principles, or they utilize overly simplistic, generic seat grids that fail to mirror real Indian cinema standards (such as row-wise price tiering, aisle separation, and government-mandated price caps).</w:t>
       </w:r>
     </w:p>
     <w:p>
@@ -4393,7 +4664,7 @@
           <w:color w:val="334155"/>
           <w:sz w:val="22"/>
         </w:rPr>
-        <w:t>Motivated by these real-world requirements, this project—developed by Kombaiya and Ashik Chandru—engineers a production-grade, lightweight, clean, and authentic Online Movie Ticket Booking &amp; Theater Management System tailored directly after real cinema portals like TicketNew and Ram Muthuram Cinemas (Tirunelveli).</w:t>
+        <w:t>Motivated by these real-world requirements, this project—developed by Kombaiya and Ashik Chandru under the supervision of MRS. RAJI at Manonmaniam Sundaranar University College, Govindaperi—engineers a production-grade, lightweight, clean, and authentic Online Movie Ticket Booking &amp; Theater Management System tailored directly after real cinema portals like TicketNew and Ram Muthuram Cinemas (Tirunelveli).</w:t>
       </w:r>
     </w:p>
     <w:p>
@@ -4407,7 +4678,7 @@
           <w:rFonts w:ascii="Calibri" w:hAnsi="Calibri"/>
           <w:b/>
           <w:color w:val="1E3A8A"/>
-          <w:sz w:val="27"/>
+          <w:sz w:val="26"/>
         </w:rPr>
         <w:t>1.2 Problem Statement</w:t>
       </w:r>
@@ -4553,7 +4824,7 @@
           <w:rFonts w:ascii="Calibri" w:hAnsi="Calibri"/>
           <w:b/>
           <w:color w:val="1E3A8A"/>
-          <w:sz w:val="27"/>
+          <w:sz w:val="26"/>
         </w:rPr>
         <w:t>1.3 Objectives of the Project</w:t>
       </w:r>
@@ -4722,7 +4993,7 @@
           <w:rFonts w:ascii="Calibri" w:hAnsi="Calibri"/>
           <w:b/>
           <w:color w:val="1E3A8A"/>
-          <w:sz w:val="27"/>
+          <w:sz w:val="26"/>
         </w:rPr>
         <w:t>1.4 Scope and System Boundaries</w:t>
       </w:r>
@@ -4758,7 +5029,7 @@
           <w:rFonts w:ascii="Calibri" w:hAnsi="Calibri"/>
           <w:b/>
           <w:color w:val="0F172A"/>
-          <w:sz w:val="34"/>
+          <w:sz w:val="32"/>
         </w:rPr>
         <w:t>CHAPTER 2: LITERATURE SURVEY &amp; FEASIBILITY STUDY</w:t>
       </w:r>
@@ -4774,7 +5045,7 @@
           <w:rFonts w:ascii="Calibri" w:hAnsi="Calibri"/>
           <w:b/>
           <w:color w:val="1E3A8A"/>
-          <w:sz w:val="27"/>
+          <w:sz w:val="26"/>
         </w:rPr>
         <w:t>2.1 Existing Ticketing Platforms Analysis</w:t>
       </w:r>
@@ -5465,7 +5736,7 @@
           <w:rFonts w:ascii="Calibri" w:hAnsi="Calibri"/>
           <w:b/>
           <w:color w:val="1E3A8A"/>
-          <w:sz w:val="27"/>
+          <w:sz w:val="26"/>
         </w:rPr>
         <w:t>2.2 Limitations of Traditional Ticketing Systems</w:t>
       </w:r>
@@ -5496,7 +5767,7 @@
           <w:rFonts w:ascii="Calibri" w:hAnsi="Calibri"/>
           <w:b/>
           <w:color w:val="1E3A8A"/>
-          <w:sz w:val="27"/>
+          <w:sz w:val="26"/>
         </w:rPr>
         <w:t>2.3 Proposed System Advancements</w:t>
       </w:r>
@@ -5619,7 +5890,7 @@
           <w:rFonts w:ascii="Calibri" w:hAnsi="Calibri"/>
           <w:b/>
           <w:color w:val="1E3A8A"/>
-          <w:sz w:val="27"/>
+          <w:sz w:val="26"/>
         </w:rPr>
         <w:t>2.4 Feasibility Study</w:t>
       </w:r>
@@ -5727,7 +5998,7 @@
           <w:rFonts w:ascii="Calibri" w:hAnsi="Calibri"/>
           <w:b/>
           <w:color w:val="0F172A"/>
-          <w:sz w:val="34"/>
+          <w:sz w:val="32"/>
         </w:rPr>
         <w:t>CHAPTER 3: SYSTEM REQUIREMENTS &amp; ARCHITECTURE</w:t>
       </w:r>
@@ -5743,7 +6014,7 @@
           <w:rFonts w:ascii="Calibri" w:hAnsi="Calibri"/>
           <w:b/>
           <w:color w:val="1E3A8A"/>
-          <w:sz w:val="27"/>
+          <w:sz w:val="26"/>
         </w:rPr>
         <w:t>3.1 Hardware and Software Specifications</w:t>
       </w:r>
@@ -7033,7 +7304,7 @@
           <w:rFonts w:ascii="Calibri" w:hAnsi="Calibri"/>
           <w:b/>
           <w:color w:val="1E3A8A"/>
-          <w:sz w:val="27"/>
+          <w:sz w:val="26"/>
         </w:rPr>
         <w:t>3.2 High-Level System Architecture</w:t>
       </w:r>
@@ -7197,7 +7468,7 @@
           <w:rFonts w:ascii="Calibri" w:hAnsi="Calibri"/>
           <w:b/>
           <w:color w:val="0F172A"/>
-          <w:sz w:val="34"/>
+          <w:sz w:val="32"/>
         </w:rPr>
         <w:t>CHAPTER 4: SYSTEM DESIGN &amp; DATA MODELING</w:t>
       </w:r>
@@ -7213,7 +7484,7 @@
           <w:rFonts w:ascii="Calibri" w:hAnsi="Calibri"/>
           <w:b/>
           <w:color w:val="1E3A8A"/>
-          <w:sz w:val="27"/>
+          <w:sz w:val="26"/>
         </w:rPr>
         <w:t>4.1 Auditorium Architectural Design (3-Block 24-Column)</w:t>
       </w:r>
@@ -8073,7 +8344,7 @@
           <w:rFonts w:ascii="Calibri" w:hAnsi="Calibri"/>
           <w:b/>
           <w:color w:val="1E3A8A"/>
-          <w:sz w:val="27"/>
+          <w:sz w:val="26"/>
         </w:rPr>
         <w:t>4.2 Database Schema &amp; Data Models</w:t>
       </w:r>
@@ -9627,7 +9898,7 @@
           <w:rFonts w:ascii="Calibri" w:hAnsi="Calibri"/>
           <w:b/>
           <w:color w:val="0F172A"/>
-          <w:sz w:val="34"/>
+          <w:sz w:val="32"/>
         </w:rPr>
         <w:t>CHAPTER 5: IMPLEMENTATION &amp; CORE ALGORITHMS</w:t>
       </w:r>
@@ -9643,7 +9914,7 @@
           <w:rFonts w:ascii="Calibri" w:hAnsi="Calibri"/>
           <w:b/>
           <w:color w:val="1E3A8A"/>
-          <w:sz w:val="27"/>
+          <w:sz w:val="26"/>
         </w:rPr>
         <w:t>5.1 Showtime Schedule Engine &amp; Date Picker</w:t>
       </w:r>
@@ -9674,7 +9945,7 @@
           <w:rFonts w:ascii="Calibri" w:hAnsi="Calibri"/>
           <w:b/>
           <w:color w:val="1E3A8A"/>
-          <w:sz w:val="27"/>
+          <w:sz w:val="26"/>
         </w:rPr>
         <w:t>5.2 Real-Time Showtime Expiration Logic</w:t>
       </w:r>
@@ -9868,7 +10139,7 @@
           <w:rFonts w:ascii="Calibri" w:hAnsi="Calibri"/>
           <w:b/>
           <w:color w:val="1E3A8A"/>
-          <w:sz w:val="27"/>
+          <w:sz w:val="26"/>
         </w:rPr>
         <w:t>5.3 Multi-User Seat Concurrency &amp; Red Color Persistence</w:t>
       </w:r>
@@ -10045,7 +10316,7 @@
           <w:rFonts w:ascii="Calibri" w:hAnsi="Calibri"/>
           <w:b/>
           <w:color w:val="1E3A8A"/>
-          <w:sz w:val="27"/>
+          <w:sz w:val="26"/>
         </w:rPr>
         <w:t>5.4 Admin Live Occupancy Matrix Implementation</w:t>
       </w:r>
@@ -10081,7 +10352,7 @@
           <w:rFonts w:ascii="Calibri" w:hAnsi="Calibri"/>
           <w:b/>
           <w:color w:val="0F172A"/>
-          <w:sz w:val="34"/>
+          <w:sz w:val="32"/>
         </w:rPr>
         <w:t>CHAPTER 6: TESTING &amp; QUALITY ASSURANCE</w:t>
       </w:r>
@@ -10097,7 +10368,7 @@
           <w:rFonts w:ascii="Calibri" w:hAnsi="Calibri"/>
           <w:b/>
           <w:color w:val="1E3A8A"/>
-          <w:sz w:val="27"/>
+          <w:sz w:val="26"/>
         </w:rPr>
         <w:t>6.1 Testing Methodology</w:t>
       </w:r>
@@ -11570,7 +11841,7 @@
           <w:rFonts w:ascii="Calibri" w:hAnsi="Calibri"/>
           <w:b/>
           <w:color w:val="0F172A"/>
-          <w:sz w:val="34"/>
+          <w:sz w:val="32"/>
         </w:rPr>
         <w:t>CHAPTER 7: RESULTS &amp; MODULE WALKTHROUGH</w:t>
       </w:r>
@@ -11586,7 +11857,7 @@
           <w:rFonts w:ascii="Calibri" w:hAnsi="Calibri"/>
           <w:b/>
           <w:color w:val="1E3A8A"/>
-          <w:sz w:val="27"/>
+          <w:sz w:val="26"/>
         </w:rPr>
         <w:t>7.1 Homepage &amp; Showtime Schedule Module</w:t>
       </w:r>
@@ -11617,7 +11888,7 @@
           <w:rFonts w:ascii="Calibri" w:hAnsi="Calibri"/>
           <w:b/>
           <w:color w:val="1E3A8A"/>
-          <w:sz w:val="27"/>
+          <w:sz w:val="26"/>
         </w:rPr>
         <w:t>7.2 Interactive Seat Selector Module</w:t>
       </w:r>
@@ -11648,7 +11919,7 @@
           <w:rFonts w:ascii="Calibri" w:hAnsi="Calibri"/>
           <w:b/>
           <w:color w:val="1E3A8A"/>
-          <w:sz w:val="27"/>
+          <w:sz w:val="26"/>
         </w:rPr>
         <w:t>7.3 Payment &amp; Digital E-Ticket Module</w:t>
       </w:r>
@@ -11679,7 +11950,7 @@
           <w:rFonts w:ascii="Calibri" w:hAnsi="Calibri"/>
           <w:b/>
           <w:color w:val="1E3A8A"/>
-          <w:sz w:val="27"/>
+          <w:sz w:val="26"/>
         </w:rPr>
         <w:t>7.4 Admin Operations &amp; Screen Occupancy Console</w:t>
       </w:r>
@@ -11715,7 +11986,7 @@
           <w:rFonts w:ascii="Calibri" w:hAnsi="Calibri"/>
           <w:b/>
           <w:color w:val="0F172A"/>
-          <w:sz w:val="34"/>
+          <w:sz w:val="32"/>
         </w:rPr>
         <w:t>CHAPTER 8: CONCLUSION &amp; FUTURE ENHANCEMENTS</w:t>
       </w:r>
@@ -11731,7 +12002,7 @@
           <w:rFonts w:ascii="Calibri" w:hAnsi="Calibri"/>
           <w:b/>
           <w:color w:val="1E3A8A"/>
-          <w:sz w:val="27"/>
+          <w:sz w:val="26"/>
         </w:rPr>
         <w:t>8.1 Project Summary</w:t>
       </w:r>
@@ -11748,7 +12019,7 @@
           <w:color w:val="334155"/>
           <w:sz w:val="22"/>
         </w:rPr>
-        <w:t>The Online Movie Ticket Booking &amp; Theater Management System represents a clean, robust, and industry-standard web engineering achievement. By eliminating distracting 3D gimmicks and food concession barriers, the platform delivers an ultra-fast, intuitive reservation workflow tailored after real Tamil Nadu cinema platforms like TicketNew and Ram Muthuram Cinemas.</w:t>
+        <w:t>The Online Movie Ticket Booking &amp; Theater Management System represents a clean, robust, and industry-standard web engineering achievement developed in the Department of Computer Science at Manonmaniam Sundaranar University College, Govindaperi. By eliminating distracting 3D gimmicks and food concession barriers, the platform delivers an ultra-fast, intuitive reservation workflow tailored after real Tamil Nadu cinema platforms like TicketNew and Ram Muthuram Cinemas.</w:t>
       </w:r>
     </w:p>
     <w:p>
@@ -11777,7 +12048,7 @@
           <w:rFonts w:ascii="Calibri" w:hAnsi="Calibri"/>
           <w:b/>
           <w:color w:val="1E3A8A"/>
-          <w:sz w:val="27"/>
+          <w:sz w:val="26"/>
         </w:rPr>
         <w:t>8.2 Engineering Insights &amp; Best Practices</w:t>
       </w:r>
@@ -11862,7 +12133,7 @@
           <w:rFonts w:ascii="Calibri" w:hAnsi="Calibri"/>
           <w:b/>
           <w:color w:val="1E3A8A"/>
-          <w:sz w:val="27"/>
+          <w:sz w:val="26"/>
         </w:rPr>
         <w:t>8.3 Future Roadmap</w:t>
       </w:r>
@@ -11952,7 +12223,7 @@
           <w:rFonts w:ascii="Calibri" w:hAnsi="Calibri"/>
           <w:b/>
           <w:color w:val="0F172A"/>
-          <w:sz w:val="34"/>
+          <w:sz w:val="32"/>
         </w:rPr>
         <w:t>REFERENCES</w:t>
       </w:r>
@@ -12085,7 +12356,7 @@
         <w:color w:val="94A3B8"/>
         <w:sz w:val="17"/>
       </w:rPr>
-      <w:t>Online Movie Ticket Booking System • Kombaiya &amp; Ashik Chandru • Dept of CSE</w:t>
+      <w:t>Online Movie Ticket Booking System • Dept of Computer Science • MSU College, Govindaperi</w:t>
     </w:r>
   </w:p>
 </w:ftr>

</xml_diff>